<commit_message>
feat: add script to generate custom Year 3 student pack document
</commit_message>
<xml_diff>
--- a/Units/English/English_Unit_3/Lesson_Plans/Lesson_14/Great_Barrier_Reef_Alternative/Year_3_Evidence_Lesson/Lesson_14_GBR_Year3_Student_Pack.docx
+++ b/Units/English/English_Unit_3/Lesson_Plans/Lesson_14/Great_Barrier_Reef_Alternative/Year_3_Evidence_Lesson/Lesson_14_GBR_Year3_Student_Pack.docx
@@ -5,6 +5,7 @@
     <w:p>
       <w:pPr>
         <w:keepNext w:val="0"/>
+        <w:pageBreakBefore w:val="0"/>
         <w:spacing w:before="0" w:after="60" w:line="240" w:lineRule="auto"/>
         <w:jc w:val="left"/>
       </w:pPr>
@@ -62,7 +63,7 @@
         <w:drawing>
           <wp:inline xmlns:a="http://schemas.openxmlformats.org/drawingml/2006/main" xmlns:pic="http://schemas.openxmlformats.org/drawingml/2006/picture">
             <wp:extent cx="6400800" cy="1280160"/>
-            <wp:docPr id="1" name="Picture 1"/>
+            <wp:docPr id="1" name="Picture 1" descr="Illustrative underwater view of living coral and fish on the Great Barrier Reef." title="Living coral reef"/>
             <wp:cNvGraphicFramePr>
               <a:graphicFrameLocks noChangeAspect="1"/>
             </wp:cNvGraphicFramePr>
@@ -163,17 +164,11 @@
     </w:tbl>
     <w:p>
       <w:pPr>
+        <w:pStyle w:val="Heading2"/>
         <w:keepNext/>
         <w:spacing w:before="120" w:after="60" w:line="240" w:lineRule="auto"/>
       </w:pPr>
       <w:r>
-        <w:rPr>
-          <w:rFonts w:ascii="Arial" w:hAnsi="Arial"/>
-          <w:b/>
-          <w:i w:val="0"/>
-          <w:color w:val="087F8C"/>
-          <w:sz w:val="28"/>
-        </w:rPr>
         <w:t>1  A huge living place</w:t>
       </w:r>
     </w:p>
@@ -213,17 +208,11 @@
     </w:p>
     <w:p>
       <w:pPr>
+        <w:pStyle w:val="Heading2"/>
         <w:keepNext/>
         <w:spacing w:before="80" w:after="60" w:line="240" w:lineRule="auto"/>
       </w:pPr>
       <w:r>
-        <w:rPr>
-          <w:rFonts w:ascii="Arial" w:hAnsi="Arial"/>
-          <w:b/>
-          <w:i w:val="0"/>
-          <w:color w:val="087F8C"/>
-          <w:sz w:val="28"/>
-        </w:rPr>
         <w:t>2  What scientists found</w:t>
       </w:r>
     </w:p>
@@ -348,17 +337,11 @@
     </w:p>
     <w:p>
       <w:pPr>
+        <w:pStyle w:val="Heading2"/>
         <w:keepNext/>
         <w:spacing w:before="80" w:after="60" w:line="240" w:lineRule="auto"/>
       </w:pPr>
       <w:r>
-        <w:rPr>
-          <w:rFonts w:ascii="Arial" w:hAnsi="Arial"/>
-          <w:b/>
-          <w:i w:val="0"/>
-          <w:color w:val="087F8C"/>
-          <w:sz w:val="28"/>
-        </w:rPr>
         <w:t>3  Two ways to help</w:t>
       </w:r>
     </w:p>
@@ -430,13 +413,9 @@
       </w:r>
     </w:p>
     <w:p>
-      <w:r>
-        <w:br w:type="page"/>
-      </w:r>
-    </w:p>
-    <w:p>
       <w:pPr>
         <w:keepNext w:val="0"/>
+        <w:pageBreakBefore/>
         <w:spacing w:before="0" w:after="60" w:line="240" w:lineRule="auto"/>
         <w:jc w:val="left"/>
       </w:pPr>
@@ -487,17 +466,11 @@
     </w:p>
     <w:p>
       <w:pPr>
+        <w:pStyle w:val="Heading1"/>
         <w:keepNext/>
         <w:spacing w:before="60" w:after="80" w:line="240" w:lineRule="auto"/>
       </w:pPr>
       <w:r>
-        <w:rPr>
-          <w:rFonts w:ascii="Arial" w:hAnsi="Arial"/>
-          <w:b/>
-          <w:i w:val="0"/>
-          <w:color w:val="073642"/>
-          <w:sz w:val="36"/>
-        </w:rPr>
         <w:t>1  Find evidence that matches</w:t>
       </w:r>
     </w:p>
@@ -1016,17 +989,11 @@
     </w:p>
     <w:p>
       <w:pPr>
+        <w:pStyle w:val="Heading1"/>
         <w:keepNext/>
         <w:spacing w:before="80" w:after="80" w:line="240" w:lineRule="auto"/>
       </w:pPr>
       <w:r>
-        <w:rPr>
-          <w:rFonts w:ascii="Arial" w:hAnsi="Arial"/>
-          <w:b/>
-          <w:i w:val="0"/>
-          <w:color w:val="073642"/>
-          <w:sz w:val="36"/>
-        </w:rPr>
         <w:t>2  Evidence or opinion?</w:t>
       </w:r>
     </w:p>
@@ -1513,17 +1480,11 @@
     </w:tbl>
     <w:p>
       <w:pPr>
+        <w:pStyle w:val="Heading1"/>
         <w:keepNext/>
         <w:spacing w:before="160" w:after="80" w:line="240" w:lineRule="auto"/>
       </w:pPr>
       <w:r>
-        <w:rPr>
-          <w:rFonts w:ascii="Arial" w:hAnsi="Arial"/>
-          <w:b/>
-          <w:i w:val="0"/>
-          <w:color w:val="073642"/>
-          <w:sz w:val="36"/>
-        </w:rPr>
         <w:t>3  Stop the overclaim</w:t>
       </w:r>
     </w:p>
@@ -1630,13 +1591,9 @@
       </w:r>
     </w:p>
     <w:p>
-      <w:r>
-        <w:br w:type="page"/>
-      </w:r>
-    </w:p>
-    <w:p>
       <w:pPr>
         <w:keepNext w:val="0"/>
+        <w:pageBreakBefore/>
         <w:spacing w:before="0" w:after="60" w:line="240" w:lineRule="auto"/>
         <w:jc w:val="left"/>
       </w:pPr>
@@ -1687,17 +1644,11 @@
     </w:p>
     <w:p>
       <w:pPr>
+        <w:pStyle w:val="Heading1"/>
         <w:keepNext/>
         <w:spacing w:before="60" w:after="80" w:line="240" w:lineRule="auto"/>
       </w:pPr>
       <w:r>
-        <w:rPr>
-          <w:rFonts w:ascii="Arial" w:hAnsi="Arial"/>
-          <w:b/>
-          <w:i w:val="0"/>
-          <w:color w:val="073642"/>
-          <w:sz w:val="36"/>
-        </w:rPr>
         <w:t>1  Read the model</w:t>
       </w:r>
     </w:p>
@@ -1718,9 +1669,9 @@
             <w:tcW w:type="dxa" w:w="10080"/>
             <w:vAlign w:val="center"/>
             <w:tcMar>
-              <w:top w:w="120" w:type="dxa"/>
+              <w:top w:w="80" w:type="dxa"/>
               <w:start w:w="120" w:type="dxa"/>
-              <w:bottom w:w="120" w:type="dxa"/>
+              <w:bottom w:w="80" w:type="dxa"/>
               <w:end w:w="120" w:type="dxa"/>
             </w:tcMar>
             <w:shd w:fill="EDF9F7" w:val="clear"/>
@@ -1761,7 +1712,7 @@
                 <w:b/>
                 <w:i w:val="0"/>
                 <w:color w:val="16333A"/>
-                <w:sz w:val="23"/>
+                <w:sz w:val="20"/>
               </w:rPr>
               <w:t>Australian decision-makers should protect the Great Barrier Reef. In 2024-25, scientists found living coral in the north, centre and south, but coral cover had fallen. This shows that the Reef is alive and needs help. Cleaner water and careful Reef management can reduce pressure on coral. Climate action is also needed because local projects cannot cool the whole ocean. Please use both kinds of action to give the Reef a better chance to recover.</w:t>
             </w:r>
@@ -1771,17 +1722,11 @@
     </w:tbl>
     <w:p>
       <w:pPr>
+        <w:pStyle w:val="Heading1"/>
         <w:keepNext/>
         <w:spacing w:before="140" w:after="80" w:line="240" w:lineRule="auto"/>
       </w:pPr>
       <w:r>
-        <w:rPr>
-          <w:rFonts w:ascii="Arial" w:hAnsi="Arial"/>
-          <w:b/>
-          <w:i w:val="0"/>
-          <w:color w:val="073642"/>
-          <w:sz w:val="36"/>
-        </w:rPr>
         <w:t>2  Plan the five moves</w:t>
       </w:r>
     </w:p>
@@ -1884,9 +1829,9 @@
             <w:tcW w:type="dxa" w:w="2240"/>
             <w:vAlign w:val="center"/>
             <w:tcMar>
-              <w:top w:w="120" w:type="dxa"/>
+              <w:top w:w="60" w:type="dxa"/>
               <w:start w:w="120" w:type="dxa"/>
-              <w:bottom w:w="120" w:type="dxa"/>
+              <w:bottom w:w="60" w:type="dxa"/>
               <w:end w:w="120" w:type="dxa"/>
             </w:tcMar>
             <w:tcBorders>
@@ -1908,6 +1853,7 @@
               <w:rPr>
                 <w:b/>
                 <w:color w:val="075663"/>
+                <w:sz w:val="20"/>
               </w:rPr>
             </w:r>
             <w:r>
@@ -1916,7 +1862,7 @@
                 <w:b w:val="0"/>
                 <w:i w:val="0"/>
                 <w:color w:val="16333A"/>
-                <w:sz w:val="22"/>
+                <w:sz w:val="20"/>
               </w:rPr>
               <w:t>1  Claim</w:t>
             </w:r>
@@ -1927,9 +1873,9 @@
             <w:tcW w:type="dxa" w:w="7840"/>
             <w:vAlign w:val="center"/>
             <w:tcMar>
-              <w:top w:w="120" w:type="dxa"/>
+              <w:top w:w="60" w:type="dxa"/>
               <w:start w:w="120" w:type="dxa"/>
-              <w:bottom w:w="120" w:type="dxa"/>
+              <w:bottom w:w="60" w:type="dxa"/>
               <w:end w:w="120" w:type="dxa"/>
             </w:tcMar>
             <w:tcBorders>
@@ -1947,14 +1893,18 @@
               <w:spacing w:before="0" w:after="40" w:line="252" w:lineRule="auto"/>
               <w:jc w:val="left"/>
             </w:pPr>
-            <w:r/>
+            <w:r>
+              <w:rPr>
+                <w:sz w:val="20"/>
+              </w:rPr>
+            </w:r>
             <w:r>
               <w:rPr>
                 <w:rFonts w:ascii="Arial" w:hAnsi="Arial"/>
                 <w:b w:val="0"/>
                 <w:i w:val="0"/>
                 <w:color w:val="16333A"/>
-                <w:sz w:val="22"/>
+                <w:sz w:val="20"/>
               </w:rPr>
               <w:t>We should __________________________________________________________</w:t>
             </w:r>
@@ -1967,9 +1917,9 @@
             <w:tcW w:type="dxa" w:w="2240"/>
             <w:vAlign w:val="center"/>
             <w:tcMar>
-              <w:top w:w="120" w:type="dxa"/>
+              <w:top w:w="60" w:type="dxa"/>
               <w:start w:w="120" w:type="dxa"/>
-              <w:bottom w:w="120" w:type="dxa"/>
+              <w:bottom w:w="60" w:type="dxa"/>
               <w:end w:w="120" w:type="dxa"/>
             </w:tcMar>
             <w:tcBorders>
@@ -1991,6 +1941,7 @@
               <w:rPr>
                 <w:b/>
                 <w:color w:val="075663"/>
+                <w:sz w:val="20"/>
               </w:rPr>
             </w:r>
             <w:r>
@@ -1999,7 +1950,7 @@
                 <w:b w:val="0"/>
                 <w:i w:val="0"/>
                 <w:color w:val="16333A"/>
-                <w:sz w:val="22"/>
+                <w:sz w:val="20"/>
               </w:rPr>
               <w:t>2  Problem fact</w:t>
             </w:r>
@@ -2010,9 +1961,9 @@
             <w:tcW w:type="dxa" w:w="7840"/>
             <w:vAlign w:val="center"/>
             <w:tcMar>
-              <w:top w:w="120" w:type="dxa"/>
+              <w:top w:w="60" w:type="dxa"/>
               <w:start w:w="120" w:type="dxa"/>
-              <w:bottom w:w="120" w:type="dxa"/>
+              <w:bottom w:w="60" w:type="dxa"/>
               <w:end w:w="120" w:type="dxa"/>
             </w:tcMar>
             <w:tcBorders>
@@ -2030,14 +1981,18 @@
               <w:spacing w:before="0" w:after="40" w:line="252" w:lineRule="auto"/>
               <w:jc w:val="left"/>
             </w:pPr>
-            <w:r/>
+            <w:r>
+              <w:rPr>
+                <w:sz w:val="20"/>
+              </w:rPr>
+            </w:r>
             <w:r>
               <w:rPr>
                 <w:rFonts w:ascii="Arial" w:hAnsi="Arial"/>
                 <w:b w:val="0"/>
                 <w:i w:val="0"/>
                 <w:color w:val="16333A"/>
-                <w:sz w:val="22"/>
+                <w:sz w:val="20"/>
               </w:rPr>
               <w:t>The article says ____________________________________________________</w:t>
             </w:r>
@@ -2050,9 +2005,9 @@
             <w:tcW w:type="dxa" w:w="2240"/>
             <w:vAlign w:val="center"/>
             <w:tcMar>
-              <w:top w:w="120" w:type="dxa"/>
+              <w:top w:w="60" w:type="dxa"/>
               <w:start w:w="120" w:type="dxa"/>
-              <w:bottom w:w="120" w:type="dxa"/>
+              <w:bottom w:w="60" w:type="dxa"/>
               <w:end w:w="120" w:type="dxa"/>
             </w:tcMar>
             <w:tcBorders>
@@ -2074,6 +2029,7 @@
               <w:rPr>
                 <w:b/>
                 <w:color w:val="075663"/>
+                <w:sz w:val="20"/>
               </w:rPr>
             </w:r>
             <w:r>
@@ -2082,7 +2038,7 @@
                 <w:b w:val="0"/>
                 <w:i w:val="0"/>
                 <w:color w:val="16333A"/>
-                <w:sz w:val="22"/>
+                <w:sz w:val="20"/>
               </w:rPr>
               <w:t>3  Explain</w:t>
             </w:r>
@@ -2093,9 +2049,9 @@
             <w:tcW w:type="dxa" w:w="7840"/>
             <w:vAlign w:val="center"/>
             <w:tcMar>
-              <w:top w:w="120" w:type="dxa"/>
+              <w:top w:w="60" w:type="dxa"/>
               <w:start w:w="120" w:type="dxa"/>
-              <w:bottom w:w="120" w:type="dxa"/>
+              <w:bottom w:w="60" w:type="dxa"/>
               <w:end w:w="120" w:type="dxa"/>
             </w:tcMar>
             <w:tcBorders>
@@ -2113,14 +2069,18 @@
               <w:spacing w:before="0" w:after="40" w:line="252" w:lineRule="auto"/>
               <w:jc w:val="left"/>
             </w:pPr>
-            <w:r/>
+            <w:r>
+              <w:rPr>
+                <w:sz w:val="20"/>
+              </w:rPr>
+            </w:r>
             <w:r>
               <w:rPr>
                 <w:rFonts w:ascii="Arial" w:hAnsi="Arial"/>
                 <w:b w:val="0"/>
                 <w:i w:val="0"/>
                 <w:color w:val="16333A"/>
-                <w:sz w:val="22"/>
+                <w:sz w:val="20"/>
               </w:rPr>
               <w:t>This shows _________________________________________________________</w:t>
             </w:r>
@@ -2133,9 +2093,9 @@
             <w:tcW w:type="dxa" w:w="2240"/>
             <w:vAlign w:val="center"/>
             <w:tcMar>
-              <w:top w:w="120" w:type="dxa"/>
+              <w:top w:w="60" w:type="dxa"/>
               <w:start w:w="120" w:type="dxa"/>
-              <w:bottom w:w="120" w:type="dxa"/>
+              <w:bottom w:w="60" w:type="dxa"/>
               <w:end w:w="120" w:type="dxa"/>
             </w:tcMar>
             <w:tcBorders>
@@ -2157,6 +2117,7 @@
               <w:rPr>
                 <w:b/>
                 <w:color w:val="075663"/>
+                <w:sz w:val="20"/>
               </w:rPr>
             </w:r>
             <w:r>
@@ -2165,7 +2126,7 @@
                 <w:b w:val="0"/>
                 <w:i w:val="0"/>
                 <w:color w:val="16333A"/>
-                <w:sz w:val="22"/>
+                <w:sz w:val="20"/>
               </w:rPr>
               <w:t>4  Action fact</w:t>
             </w:r>
@@ -2176,9 +2137,9 @@
             <w:tcW w:type="dxa" w:w="7840"/>
             <w:vAlign w:val="center"/>
             <w:tcMar>
-              <w:top w:w="120" w:type="dxa"/>
+              <w:top w:w="60" w:type="dxa"/>
               <w:start w:w="120" w:type="dxa"/>
-              <w:bottom w:w="120" w:type="dxa"/>
+              <w:bottom w:w="60" w:type="dxa"/>
               <w:end w:w="120" w:type="dxa"/>
             </w:tcMar>
             <w:tcBorders>
@@ -2196,14 +2157,18 @@
               <w:spacing w:before="0" w:after="40" w:line="252" w:lineRule="auto"/>
               <w:jc w:val="left"/>
             </w:pPr>
-            <w:r/>
+            <w:r>
+              <w:rPr>
+                <w:sz w:val="20"/>
+              </w:rPr>
+            </w:r>
             <w:r>
               <w:rPr>
                 <w:rFonts w:ascii="Arial" w:hAnsi="Arial"/>
                 <w:b w:val="0"/>
                 <w:i w:val="0"/>
                 <w:color w:val="16333A"/>
-                <w:sz w:val="22"/>
+                <w:sz w:val="20"/>
               </w:rPr>
               <w:t>Another fact is _____________________________________________________</w:t>
             </w:r>
@@ -2216,9 +2181,9 @@
             <w:tcW w:type="dxa" w:w="2240"/>
             <w:vAlign w:val="center"/>
             <w:tcMar>
-              <w:top w:w="120" w:type="dxa"/>
+              <w:top w:w="60" w:type="dxa"/>
               <w:start w:w="120" w:type="dxa"/>
-              <w:bottom w:w="120" w:type="dxa"/>
+              <w:bottom w:w="60" w:type="dxa"/>
               <w:end w:w="120" w:type="dxa"/>
             </w:tcMar>
             <w:tcBorders>
@@ -2240,6 +2205,7 @@
               <w:rPr>
                 <w:b/>
                 <w:color w:val="075663"/>
+                <w:sz w:val="20"/>
               </w:rPr>
             </w:r>
             <w:r>
@@ -2248,7 +2214,7 @@
                 <w:b w:val="0"/>
                 <w:i w:val="0"/>
                 <w:color w:val="16333A"/>
-                <w:sz w:val="22"/>
+                <w:sz w:val="20"/>
               </w:rPr>
               <w:t>5  Request</w:t>
             </w:r>
@@ -2259,9 +2225,9 @@
             <w:tcW w:type="dxa" w:w="7840"/>
             <w:vAlign w:val="center"/>
             <w:tcMar>
-              <w:top w:w="120" w:type="dxa"/>
+              <w:top w:w="60" w:type="dxa"/>
               <w:start w:w="120" w:type="dxa"/>
-              <w:bottom w:w="120" w:type="dxa"/>
+              <w:bottom w:w="60" w:type="dxa"/>
               <w:end w:w="120" w:type="dxa"/>
             </w:tcMar>
             <w:tcBorders>
@@ -2279,14 +2245,18 @@
               <w:spacing w:before="0" w:after="40" w:line="252" w:lineRule="auto"/>
               <w:jc w:val="left"/>
             </w:pPr>
-            <w:r/>
+            <w:r>
+              <w:rPr>
+                <w:sz w:val="20"/>
+              </w:rPr>
+            </w:r>
             <w:r>
               <w:rPr>
                 <w:rFonts w:ascii="Arial" w:hAnsi="Arial"/>
                 <w:b w:val="0"/>
                 <w:i w:val="0"/>
                 <w:color w:val="16333A"/>
-                <w:sz w:val="22"/>
+                <w:sz w:val="20"/>
               </w:rPr>
               <w:t>Please _____________________________________________________________</w:t>
             </w:r>
@@ -2296,24 +2266,18 @@
     </w:tbl>
     <w:p>
       <w:pPr>
+        <w:pStyle w:val="Heading1"/>
         <w:keepNext/>
         <w:spacing w:before="160" w:after="80" w:line="240" w:lineRule="auto"/>
       </w:pPr>
       <w:r>
-        <w:rPr>
-          <w:rFonts w:ascii="Arial" w:hAnsi="Arial"/>
-          <w:b/>
-          <w:i w:val="0"/>
-          <w:color w:val="073642"/>
-          <w:sz w:val="36"/>
-        </w:rPr>
         <w:t>3  Write your paragraph</w:t>
       </w:r>
     </w:p>
     <w:p>
       <w:pPr>
         <w:keepNext w:val="0"/>
-        <w:spacing w:before="0" w:after="80" w:line="240" w:lineRule="auto"/>
+        <w:spacing w:before="0" w:after="40" w:line="240" w:lineRule="auto"/>
         <w:jc w:val="left"/>
       </w:pPr>
       <w:r>
@@ -2322,7 +2286,7 @@
           <w:b w:val="0"/>
           <w:i w:val="0"/>
           <w:color w:val="16333A"/>
-          <w:sz w:val="23"/>
+          <w:sz w:val="22"/>
         </w:rPr>
         <w:t>___________________________________________________________________________________________</w:t>
       </w:r>
@@ -2330,7 +2294,7 @@
     <w:p>
       <w:pPr>
         <w:keepNext w:val="0"/>
-        <w:spacing w:before="0" w:after="80" w:line="240" w:lineRule="auto"/>
+        <w:spacing w:before="0" w:after="40" w:line="240" w:lineRule="auto"/>
         <w:jc w:val="left"/>
       </w:pPr>
       <w:r>
@@ -2339,7 +2303,7 @@
           <w:b w:val="0"/>
           <w:i w:val="0"/>
           <w:color w:val="16333A"/>
-          <w:sz w:val="23"/>
+          <w:sz w:val="22"/>
         </w:rPr>
         <w:t>___________________________________________________________________________________________</w:t>
       </w:r>
@@ -2347,7 +2311,7 @@
     <w:p>
       <w:pPr>
         <w:keepNext w:val="0"/>
-        <w:spacing w:before="0" w:after="80" w:line="240" w:lineRule="auto"/>
+        <w:spacing w:before="0" w:after="40" w:line="240" w:lineRule="auto"/>
         <w:jc w:val="left"/>
       </w:pPr>
       <w:r>
@@ -2356,7 +2320,7 @@
           <w:b w:val="0"/>
           <w:i w:val="0"/>
           <w:color w:val="16333A"/>
-          <w:sz w:val="23"/>
+          <w:sz w:val="22"/>
         </w:rPr>
         <w:t>___________________________________________________________________________________________</w:t>
       </w:r>
@@ -2364,7 +2328,7 @@
     <w:p>
       <w:pPr>
         <w:keepNext w:val="0"/>
-        <w:spacing w:before="0" w:after="80" w:line="240" w:lineRule="auto"/>
+        <w:spacing w:before="0" w:after="40" w:line="240" w:lineRule="auto"/>
         <w:jc w:val="left"/>
       </w:pPr>
       <w:r>
@@ -2373,7 +2337,7 @@
           <w:b w:val="0"/>
           <w:i w:val="0"/>
           <w:color w:val="16333A"/>
-          <w:sz w:val="23"/>
+          <w:sz w:val="22"/>
         </w:rPr>
         <w:t>___________________________________________________________________________________________</w:t>
       </w:r>
@@ -2381,7 +2345,7 @@
     <w:p>
       <w:pPr>
         <w:keepNext w:val="0"/>
-        <w:spacing w:before="0" w:after="80" w:line="240" w:lineRule="auto"/>
+        <w:spacing w:before="0" w:after="40" w:line="240" w:lineRule="auto"/>
         <w:jc w:val="left"/>
       </w:pPr>
       <w:r>
@@ -2390,7 +2354,7 @@
           <w:b w:val="0"/>
           <w:i w:val="0"/>
           <w:color w:val="16333A"/>
-          <w:sz w:val="23"/>
+          <w:sz w:val="22"/>
         </w:rPr>
         <w:t>___________________________________________________________________________________________</w:t>
       </w:r>
@@ -2398,7 +2362,7 @@
     <w:p>
       <w:pPr>
         <w:keepNext w:val="0"/>
-        <w:spacing w:before="0" w:after="80" w:line="240" w:lineRule="auto"/>
+        <w:spacing w:before="0" w:after="40" w:line="240" w:lineRule="auto"/>
         <w:jc w:val="left"/>
       </w:pPr>
       <w:r>
@@ -2407,7 +2371,7 @@
           <w:b w:val="0"/>
           <w:i w:val="0"/>
           <w:color w:val="16333A"/>
-          <w:sz w:val="23"/>
+          <w:sz w:val="22"/>
         </w:rPr>
         <w:t>___________________________________________________________________________________________</w:t>
       </w:r>
@@ -2415,7 +2379,7 @@
     <w:p>
       <w:pPr>
         <w:keepNext w:val="0"/>
-        <w:spacing w:before="0" w:after="80" w:line="240" w:lineRule="auto"/>
+        <w:spacing w:before="0" w:after="40" w:line="240" w:lineRule="auto"/>
         <w:jc w:val="left"/>
       </w:pPr>
       <w:r>
@@ -2424,41 +2388,18 @@
           <w:b w:val="0"/>
           <w:i w:val="0"/>
           <w:color w:val="16333A"/>
-          <w:sz w:val="23"/>
+          <w:sz w:val="22"/>
         </w:rPr>
         <w:t>___________________________________________________________________________________________</w:t>
       </w:r>
     </w:p>
     <w:p>
       <w:pPr>
-        <w:keepNext w:val="0"/>
-        <w:spacing w:before="0" w:after="80" w:line="240" w:lineRule="auto"/>
-        <w:jc w:val="left"/>
+        <w:pStyle w:val="Heading1"/>
+        <w:keepNext/>
+        <w:spacing w:before="40" w:after="40" w:line="240" w:lineRule="auto"/>
       </w:pPr>
       <w:r>
-        <w:rPr>
-          <w:rFonts w:ascii="Arial" w:hAnsi="Arial"/>
-          <w:b w:val="0"/>
-          <w:i w:val="0"/>
-          <w:color w:val="16333A"/>
-          <w:sz w:val="23"/>
-        </w:rPr>
-        <w:t>___________________________________________________________________________________________</w:t>
-      </w:r>
-    </w:p>
-    <w:p>
-      <w:pPr>
-        <w:keepNext/>
-        <w:spacing w:before="80" w:after="80" w:line="240" w:lineRule="auto"/>
-      </w:pPr>
-      <w:r>
-        <w:rPr>
-          <w:rFonts w:ascii="Arial" w:hAnsi="Arial"/>
-          <w:b/>
-          <w:i w:val="0"/>
-          <w:color w:val="073642"/>
-          <w:sz w:val="36"/>
-        </w:rPr>
         <w:t>4  Evidence check and revise</w:t>
       </w:r>
     </w:p>
@@ -2594,16 +2535,13 @@
     </w:tbl>
     <w:p>
       <w:pPr>
+        <w:pStyle w:val="Heading2"/>
         <w:keepNext/>
-        <w:spacing w:before="160" w:after="60" w:line="240" w:lineRule="auto"/>
+        <w:spacing w:before="100" w:after="40" w:line="240" w:lineRule="auto"/>
       </w:pPr>
       <w:r>
         <w:rPr>
-          <w:rFonts w:ascii="Arial" w:hAnsi="Arial"/>
-          <w:b/>
-          <w:i w:val="0"/>
           <w:color w:val="D94F45"/>
-          <w:sz w:val="28"/>
         </w:rPr>
         <w:t>EXIT  Prove one idea</w:t>
       </w:r>
@@ -2620,7 +2558,7 @@
           <w:b/>
           <w:i w:val="0"/>
           <w:color w:val="16333A"/>
-          <w:sz w:val="23"/>
+          <w:sz w:val="22"/>
         </w:rPr>
         <w:t>We should __________________ because the article says _________________________________.</w:t>
       </w:r>
@@ -2637,7 +2575,7 @@
           <w:b/>
           <w:i w:val="0"/>
           <w:color w:val="16333A"/>
-          <w:sz w:val="23"/>
+          <w:sz w:val="22"/>
         </w:rPr>
         <w:t>This shows _____________________________________________________________________________.</w:t>
       </w:r>
@@ -3130,15 +3068,15 @@
     <w:pPr>
       <w:keepNext/>
       <w:keepLines/>
-      <w:spacing w:before="480" w:after="0"/>
+      <w:spacing w:before="200" w:after="80" w:line="240" w:lineRule="auto"/>
       <w:outlineLvl w:val="0"/>
     </w:pPr>
     <w:rPr>
-      <w:rFonts w:asciiTheme="majorHAnsi" w:eastAsiaTheme="majorEastAsia" w:hAnsiTheme="majorHAnsi" w:cstheme="majorBidi"/>
+      <w:rFonts w:asciiTheme="majorHAnsi" w:eastAsiaTheme="majorEastAsia" w:hAnsiTheme="majorHAnsi" w:cstheme="majorBidi" w:ascii="Arial" w:hAnsi="Arial"/>
       <w:b/>
       <w:bCs/>
-      <w:color w:val="365F91" w:themeColor="accent1" w:themeShade="BF"/>
-      <w:sz w:val="28"/>
+      <w:color w:val="073642"/>
+      <w:sz w:val="36"/>
       <w:szCs w:val="28"/>
     </w:rPr>
   </w:style>
@@ -3154,15 +3092,15 @@
     <w:pPr>
       <w:keepNext/>
       <w:keepLines/>
-      <w:spacing w:before="200" w:after="0"/>
+      <w:spacing w:before="140" w:after="60" w:line="240" w:lineRule="auto"/>
       <w:outlineLvl w:val="1"/>
     </w:pPr>
     <w:rPr>
-      <w:rFonts w:asciiTheme="majorHAnsi" w:eastAsiaTheme="majorEastAsia" w:hAnsiTheme="majorHAnsi" w:cstheme="majorBidi"/>
+      <w:rFonts w:asciiTheme="majorHAnsi" w:eastAsiaTheme="majorEastAsia" w:hAnsiTheme="majorHAnsi" w:cstheme="majorBidi" w:ascii="Arial" w:hAnsi="Arial"/>
       <w:b/>
       <w:bCs/>
-      <w:color w:val="4F81BD" w:themeColor="accent1"/>
-      <w:sz w:val="26"/>
+      <w:color w:val="087F8C"/>
+      <w:sz w:val="28"/>
       <w:szCs w:val="26"/>
     </w:rPr>
   </w:style>

</xml_diff>